<commit_message>
All the tests passed
</commit_message>
<xml_diff>
--- a/Lab3/docs/report.docx
+++ b/Lab3/docs/report.docx
@@ -1728,7 +1728,7 @@
     <w:p>
       <w:pPr>
         <w:spacing w:line="360" w:lineRule="auto"/>
-        <w:ind w:hanging="450"/>
+        <w:ind w:firstLine="720"/>
         <w:jc w:val="both"/>
         <w:rPr>
           <w:rFonts w:ascii="Times New Roman" w:eastAsia="Times New Roman" w:hAnsi="Times New Roman" w:cs="Times New Roman"/>
@@ -1930,7 +1930,7 @@
     <w:p>
       <w:pPr>
         <w:spacing w:line="360" w:lineRule="auto"/>
-        <w:ind w:hanging="450"/>
+        <w:ind w:firstLine="720"/>
         <w:jc w:val="both"/>
         <w:rPr>
           <w:rFonts w:ascii="Times New Roman" w:eastAsia="Times New Roman" w:hAnsi="Times New Roman" w:cs="Times New Roman"/>
@@ -2082,195 +2082,18 @@
         </w:rPr>
         <w:t> </w:t>
       </w:r>
-      <w:r>
-        <w:rPr>
-          <w:rFonts w:ascii="Times New Roman" w:eastAsia="Times New Roman" w:hAnsi="Times New Roman" w:cs="Times New Roman"/>
-          <w:color w:val="212529"/>
-          <w:sz w:val="24"/>
-          <w:szCs w:val="24"/>
-          <w:lang w:val="en-US"/>
-        </w:rPr>
-        <w:fldChar w:fldCharType="begin"/>
-      </w:r>
-      <w:r>
-        <w:rPr>
-          <w:rFonts w:ascii="Times New Roman" w:eastAsia="Times New Roman" w:hAnsi="Times New Roman" w:cs="Times New Roman"/>
-          <w:color w:val="212529"/>
-          <w:sz w:val="24"/>
-          <w:szCs w:val="24"/>
-          <w:lang w:val="en-US"/>
-        </w:rPr>
-        <w:instrText>HYPERLINK</w:instrText>
-      </w:r>
-      <w:r>
-        <w:rPr>
-          <w:rFonts w:ascii="Times New Roman" w:eastAsia="Times New Roman" w:hAnsi="Times New Roman" w:cs="Times New Roman"/>
-          <w:color w:val="212529"/>
-          <w:sz w:val="24"/>
-          <w:szCs w:val="24"/>
-          <w:lang w:val="ru-RU"/>
-        </w:rPr>
-        <w:instrText xml:space="preserve"> "</w:instrText>
-      </w:r>
-      <w:r>
-        <w:rPr>
-          <w:rFonts w:ascii="Times New Roman" w:eastAsia="Times New Roman" w:hAnsi="Times New Roman" w:cs="Times New Roman"/>
-          <w:color w:val="212529"/>
-          <w:sz w:val="24"/>
-          <w:szCs w:val="24"/>
-          <w:lang w:val="en-US"/>
-        </w:rPr>
-        <w:instrText>http</w:instrText>
-      </w:r>
-      <w:r>
-        <w:rPr>
-          <w:rFonts w:ascii="Times New Roman" w:eastAsia="Times New Roman" w:hAnsi="Times New Roman" w:cs="Times New Roman"/>
-          <w:color w:val="212529"/>
-          <w:sz w:val="24"/>
-          <w:szCs w:val="24"/>
-          <w:lang w:val="ru-RU"/>
-        </w:rPr>
-        <w:instrText>://</w:instrText>
-      </w:r>
-      <w:r>
-        <w:rPr>
-          <w:rFonts w:ascii="Times New Roman" w:eastAsia="Times New Roman" w:hAnsi="Times New Roman" w:cs="Times New Roman"/>
-          <w:color w:val="212529"/>
-          <w:sz w:val="24"/>
-          <w:szCs w:val="24"/>
-          <w:lang w:val="en-US"/>
-        </w:rPr>
-        <w:instrText>docs</w:instrText>
-      </w:r>
-      <w:r>
-        <w:rPr>
-          <w:rFonts w:ascii="Times New Roman" w:eastAsia="Times New Roman" w:hAnsi="Times New Roman" w:cs="Times New Roman"/>
-          <w:color w:val="212529"/>
-          <w:sz w:val="24"/>
-          <w:szCs w:val="24"/>
-          <w:lang w:val="ru-RU"/>
-        </w:rPr>
-        <w:instrText>.</w:instrText>
-      </w:r>
-      <w:r>
-        <w:rPr>
-          <w:rFonts w:ascii="Times New Roman" w:eastAsia="Times New Roman" w:hAnsi="Times New Roman" w:cs="Times New Roman"/>
-          <w:color w:val="212529"/>
-          <w:sz w:val="24"/>
-          <w:szCs w:val="24"/>
-          <w:lang w:val="en-US"/>
-        </w:rPr>
-        <w:instrText>seleniumhq</w:instrText>
-      </w:r>
-      <w:r>
-        <w:rPr>
-          <w:rFonts w:ascii="Times New Roman" w:eastAsia="Times New Roman" w:hAnsi="Times New Roman" w:cs="Times New Roman"/>
-          <w:color w:val="212529"/>
-          <w:sz w:val="24"/>
-          <w:szCs w:val="24"/>
-          <w:lang w:val="ru-RU"/>
-        </w:rPr>
-        <w:instrText>.</w:instrText>
-      </w:r>
-      <w:r>
-        <w:rPr>
-          <w:rFonts w:ascii="Times New Roman" w:eastAsia="Times New Roman" w:hAnsi="Times New Roman" w:cs="Times New Roman"/>
-          <w:color w:val="212529"/>
-          <w:sz w:val="24"/>
-          <w:szCs w:val="24"/>
-          <w:lang w:val="en-US"/>
-        </w:rPr>
-        <w:instrText>org</w:instrText>
-      </w:r>
-      <w:r>
-        <w:rPr>
-          <w:rFonts w:ascii="Times New Roman" w:eastAsia="Times New Roman" w:hAnsi="Times New Roman" w:cs="Times New Roman"/>
-          <w:color w:val="212529"/>
-          <w:sz w:val="24"/>
-          <w:szCs w:val="24"/>
-          <w:lang w:val="ru-RU"/>
-        </w:rPr>
-        <w:instrText>/" \</w:instrText>
-      </w:r>
-      <w:r>
-        <w:rPr>
-          <w:rFonts w:ascii="Times New Roman" w:eastAsia="Times New Roman" w:hAnsi="Times New Roman" w:cs="Times New Roman"/>
-          <w:color w:val="212529"/>
-          <w:sz w:val="24"/>
-          <w:szCs w:val="24"/>
-          <w:lang w:val="en-US"/>
-        </w:rPr>
-        <w:instrText>t</w:instrText>
-      </w:r>
-      <w:r>
-        <w:rPr>
-          <w:rFonts w:ascii="Times New Roman" w:eastAsia="Times New Roman" w:hAnsi="Times New Roman" w:cs="Times New Roman"/>
-          <w:color w:val="212529"/>
-          <w:sz w:val="24"/>
-          <w:szCs w:val="24"/>
-          <w:lang w:val="ru-RU"/>
-        </w:rPr>
-        <w:instrText xml:space="preserve"> "_</w:instrText>
-      </w:r>
-      <w:r>
-        <w:rPr>
-          <w:rFonts w:ascii="Times New Roman" w:eastAsia="Times New Roman" w:hAnsi="Times New Roman" w:cs="Times New Roman"/>
-          <w:color w:val="212529"/>
-          <w:sz w:val="24"/>
-          <w:szCs w:val="24"/>
-          <w:lang w:val="en-US"/>
-        </w:rPr>
-        <w:instrText>blank</w:instrText>
-      </w:r>
-      <w:r>
-        <w:rPr>
-          <w:rFonts w:ascii="Times New Roman" w:eastAsia="Times New Roman" w:hAnsi="Times New Roman" w:cs="Times New Roman"/>
-          <w:color w:val="212529"/>
-          <w:sz w:val="24"/>
-          <w:szCs w:val="24"/>
-          <w:lang w:val="ru-RU"/>
-        </w:rPr>
-        <w:instrText>"</w:instrText>
-      </w:r>
-      <w:r>
-        <w:rPr>
-          <w:rFonts w:ascii="Times New Roman" w:eastAsia="Times New Roman" w:hAnsi="Times New Roman" w:cs="Times New Roman"/>
-          <w:color w:val="212529"/>
-          <w:sz w:val="24"/>
-          <w:szCs w:val="24"/>
-          <w:lang w:val="en-US"/>
-        </w:rPr>
-      </w:r>
-      <w:r>
-        <w:rPr>
-          <w:rFonts w:ascii="Times New Roman" w:eastAsia="Times New Roman" w:hAnsi="Times New Roman" w:cs="Times New Roman"/>
-          <w:color w:val="212529"/>
-          <w:sz w:val="24"/>
-          <w:szCs w:val="24"/>
-          <w:lang w:val="en-US"/>
-        </w:rPr>
-        <w:fldChar w:fldCharType="separate"/>
-      </w:r>
-      <w:r>
-        <w:rPr>
-          <w:rStyle w:val="Hyperlink"/>
-          <w:rFonts w:ascii="Times New Roman" w:eastAsia="Times New Roman" w:hAnsi="Times New Roman" w:cs="Times New Roman"/>
-          <w:sz w:val="24"/>
-          <w:szCs w:val="24"/>
-          <w:lang w:val="en-US"/>
-        </w:rPr>
-        <w:t>Selenium</w:t>
-      </w:r>
-      <w:r>
-        <w:rPr>
-          <w:rFonts w:ascii="Times New Roman" w:eastAsia="Times New Roman" w:hAnsi="Times New Roman" w:cs="Times New Roman"/>
-          <w:color w:val="212529"/>
-          <w:sz w:val="24"/>
-          <w:szCs w:val="24"/>
-          <w:lang w:val="vi-VN"/>
-        </w:rPr>
-        <w:fldChar w:fldCharType="end"/>
-      </w:r>
+      <w:hyperlink r:id="rId7" w:tgtFrame="_blank" w:history="1">
+        <w:r>
+          <w:rPr>
+            <w:rStyle w:val="Hyperlink"/>
+            <w:rFonts w:ascii="Times New Roman" w:eastAsia="Times New Roman" w:hAnsi="Times New Roman" w:cs="Times New Roman"/>
+            <w:sz w:val="24"/>
+            <w:szCs w:val="24"/>
+            <w:lang w:val="en-US"/>
+          </w:rPr>
+          <w:t>Selenium</w:t>
+        </w:r>
+      </w:hyperlink>
       <w:r>
         <w:rPr>
           <w:rFonts w:ascii="Times New Roman" w:eastAsia="Times New Roman" w:hAnsi="Times New Roman" w:cs="Times New Roman"/>
@@ -2505,235 +2328,18 @@
         </w:rPr>
         <w:t> </w:t>
       </w:r>
-      <w:r>
-        <w:rPr>
-          <w:rFonts w:ascii="Times New Roman" w:eastAsia="Times New Roman" w:hAnsi="Times New Roman" w:cs="Times New Roman"/>
-          <w:color w:val="212529"/>
-          <w:sz w:val="24"/>
-          <w:szCs w:val="24"/>
-          <w:lang w:val="en-US"/>
-        </w:rPr>
-        <w:fldChar w:fldCharType="begin"/>
-      </w:r>
-      <w:r>
-        <w:rPr>
-          <w:rFonts w:ascii="Times New Roman" w:eastAsia="Times New Roman" w:hAnsi="Times New Roman" w:cs="Times New Roman"/>
-          <w:color w:val="212529"/>
-          <w:sz w:val="24"/>
-          <w:szCs w:val="24"/>
-          <w:lang w:val="en-US"/>
-        </w:rPr>
-        <w:instrText>HYPERLINK</w:instrText>
-      </w:r>
-      <w:r>
-        <w:rPr>
-          <w:rFonts w:ascii="Times New Roman" w:eastAsia="Times New Roman" w:hAnsi="Times New Roman" w:cs="Times New Roman"/>
-          <w:color w:val="212529"/>
-          <w:sz w:val="24"/>
-          <w:szCs w:val="24"/>
-          <w:lang w:val="ru-RU"/>
-        </w:rPr>
-        <w:instrText xml:space="preserve"> "</w:instrText>
-      </w:r>
-      <w:r>
-        <w:rPr>
-          <w:rFonts w:ascii="Times New Roman" w:eastAsia="Times New Roman" w:hAnsi="Times New Roman" w:cs="Times New Roman"/>
-          <w:color w:val="212529"/>
-          <w:sz w:val="24"/>
-          <w:szCs w:val="24"/>
-          <w:lang w:val="en-US"/>
-        </w:rPr>
-        <w:instrText>http</w:instrText>
-      </w:r>
-      <w:r>
-        <w:rPr>
-          <w:rFonts w:ascii="Times New Roman" w:eastAsia="Times New Roman" w:hAnsi="Times New Roman" w:cs="Times New Roman"/>
-          <w:color w:val="212529"/>
-          <w:sz w:val="24"/>
-          <w:szCs w:val="24"/>
-          <w:lang w:val="ru-RU"/>
-        </w:rPr>
-        <w:instrText>://</w:instrText>
-      </w:r>
-      <w:r>
-        <w:rPr>
-          <w:rFonts w:ascii="Times New Roman" w:eastAsia="Times New Roman" w:hAnsi="Times New Roman" w:cs="Times New Roman"/>
-          <w:color w:val="212529"/>
-          <w:sz w:val="24"/>
-          <w:szCs w:val="24"/>
-          <w:lang w:val="en-US"/>
-        </w:rPr>
-        <w:instrText>ru</w:instrText>
-      </w:r>
-      <w:r>
-        <w:rPr>
-          <w:rFonts w:ascii="Times New Roman" w:eastAsia="Times New Roman" w:hAnsi="Times New Roman" w:cs="Times New Roman"/>
-          <w:color w:val="212529"/>
-          <w:sz w:val="24"/>
-          <w:szCs w:val="24"/>
-          <w:lang w:val="ru-RU"/>
-        </w:rPr>
-        <w:instrText>.</w:instrText>
-      </w:r>
-      <w:r>
-        <w:rPr>
-          <w:rFonts w:ascii="Times New Roman" w:eastAsia="Times New Roman" w:hAnsi="Times New Roman" w:cs="Times New Roman"/>
-          <w:color w:val="212529"/>
-          <w:sz w:val="24"/>
-          <w:szCs w:val="24"/>
-          <w:lang w:val="en-US"/>
-        </w:rPr>
-        <w:instrText>wikipedia</w:instrText>
-      </w:r>
-      <w:r>
-        <w:rPr>
-          <w:rFonts w:ascii="Times New Roman" w:eastAsia="Times New Roman" w:hAnsi="Times New Roman" w:cs="Times New Roman"/>
-          <w:color w:val="212529"/>
-          <w:sz w:val="24"/>
-          <w:szCs w:val="24"/>
-          <w:lang w:val="ru-RU"/>
-        </w:rPr>
-        <w:instrText>.</w:instrText>
-      </w:r>
-      <w:r>
-        <w:rPr>
-          <w:rFonts w:ascii="Times New Roman" w:eastAsia="Times New Roman" w:hAnsi="Times New Roman" w:cs="Times New Roman"/>
-          <w:color w:val="212529"/>
-          <w:sz w:val="24"/>
-          <w:szCs w:val="24"/>
-          <w:lang w:val="en-US"/>
-        </w:rPr>
-        <w:instrText>org</w:instrText>
-      </w:r>
-      <w:r>
-        <w:rPr>
-          <w:rFonts w:ascii="Times New Roman" w:eastAsia="Times New Roman" w:hAnsi="Times New Roman" w:cs="Times New Roman"/>
-          <w:color w:val="212529"/>
-          <w:sz w:val="24"/>
-          <w:szCs w:val="24"/>
-          <w:lang w:val="ru-RU"/>
-        </w:rPr>
-        <w:instrText>/</w:instrText>
-      </w:r>
-      <w:r>
-        <w:rPr>
-          <w:rFonts w:ascii="Times New Roman" w:eastAsia="Times New Roman" w:hAnsi="Times New Roman" w:cs="Times New Roman"/>
-          <w:color w:val="212529"/>
-          <w:sz w:val="24"/>
-          <w:szCs w:val="24"/>
-          <w:lang w:val="en-US"/>
-        </w:rPr>
-        <w:instrText>wiki</w:instrText>
-      </w:r>
-      <w:r>
-        <w:rPr>
-          <w:rFonts w:ascii="Times New Roman" w:eastAsia="Times New Roman" w:hAnsi="Times New Roman" w:cs="Times New Roman"/>
-          <w:color w:val="212529"/>
-          <w:sz w:val="24"/>
-          <w:szCs w:val="24"/>
-          <w:lang w:val="ru-RU"/>
-        </w:rPr>
-        <w:instrText>/</w:instrText>
-      </w:r>
-      <w:r>
-        <w:rPr>
-          <w:rFonts w:ascii="Times New Roman" w:eastAsia="Times New Roman" w:hAnsi="Times New Roman" w:cs="Times New Roman"/>
-          <w:color w:val="212529"/>
-          <w:sz w:val="24"/>
-          <w:szCs w:val="24"/>
-          <w:lang w:val="en-US"/>
-        </w:rPr>
-        <w:instrText>XPath</w:instrText>
-      </w:r>
-      <w:r>
-        <w:rPr>
-          <w:rFonts w:ascii="Times New Roman" w:eastAsia="Times New Roman" w:hAnsi="Times New Roman" w:cs="Times New Roman"/>
-          <w:color w:val="212529"/>
-          <w:sz w:val="24"/>
-          <w:szCs w:val="24"/>
-          <w:lang w:val="ru-RU"/>
-        </w:rPr>
-        <w:instrText>" \</w:instrText>
-      </w:r>
-      <w:r>
-        <w:rPr>
-          <w:rFonts w:ascii="Times New Roman" w:eastAsia="Times New Roman" w:hAnsi="Times New Roman" w:cs="Times New Roman"/>
-          <w:color w:val="212529"/>
-          <w:sz w:val="24"/>
-          <w:szCs w:val="24"/>
-          <w:lang w:val="en-US"/>
-        </w:rPr>
-        <w:instrText>t</w:instrText>
-      </w:r>
-      <w:r>
-        <w:rPr>
-          <w:rFonts w:ascii="Times New Roman" w:eastAsia="Times New Roman" w:hAnsi="Times New Roman" w:cs="Times New Roman"/>
-          <w:color w:val="212529"/>
-          <w:sz w:val="24"/>
-          <w:szCs w:val="24"/>
-          <w:lang w:val="ru-RU"/>
-        </w:rPr>
-        <w:instrText xml:space="preserve"> "_</w:instrText>
-      </w:r>
-      <w:r>
-        <w:rPr>
-          <w:rFonts w:ascii="Times New Roman" w:eastAsia="Times New Roman" w:hAnsi="Times New Roman" w:cs="Times New Roman"/>
-          <w:color w:val="212529"/>
-          <w:sz w:val="24"/>
-          <w:szCs w:val="24"/>
-          <w:lang w:val="en-US"/>
-        </w:rPr>
-        <w:instrText>blank</w:instrText>
-      </w:r>
-      <w:r>
-        <w:rPr>
-          <w:rFonts w:ascii="Times New Roman" w:eastAsia="Times New Roman" w:hAnsi="Times New Roman" w:cs="Times New Roman"/>
-          <w:color w:val="212529"/>
-          <w:sz w:val="24"/>
-          <w:szCs w:val="24"/>
-          <w:lang w:val="ru-RU"/>
-        </w:rPr>
-        <w:instrText>"</w:instrText>
-      </w:r>
-      <w:r>
-        <w:rPr>
-          <w:rFonts w:ascii="Times New Roman" w:eastAsia="Times New Roman" w:hAnsi="Times New Roman" w:cs="Times New Roman"/>
-          <w:color w:val="212529"/>
-          <w:sz w:val="24"/>
-          <w:szCs w:val="24"/>
-          <w:lang w:val="en-US"/>
-        </w:rPr>
-      </w:r>
-      <w:r>
-        <w:rPr>
-          <w:rFonts w:ascii="Times New Roman" w:eastAsia="Times New Roman" w:hAnsi="Times New Roman" w:cs="Times New Roman"/>
-          <w:color w:val="212529"/>
-          <w:sz w:val="24"/>
-          <w:szCs w:val="24"/>
-          <w:lang w:val="en-US"/>
-        </w:rPr>
-        <w:fldChar w:fldCharType="separate"/>
-      </w:r>
-      <w:r>
-        <w:rPr>
-          <w:rStyle w:val="Hyperlink"/>
-          <w:rFonts w:ascii="Times New Roman" w:eastAsia="Times New Roman" w:hAnsi="Times New Roman" w:cs="Times New Roman"/>
-          <w:sz w:val="24"/>
-          <w:szCs w:val="24"/>
-          <w:lang w:val="en-US"/>
-        </w:rPr>
-        <w:t>XPath</w:t>
-      </w:r>
-      <w:r>
-        <w:rPr>
-          <w:rFonts w:ascii="Times New Roman" w:eastAsia="Times New Roman" w:hAnsi="Times New Roman" w:cs="Times New Roman"/>
-          <w:color w:val="212529"/>
-          <w:sz w:val="24"/>
-          <w:szCs w:val="24"/>
-          <w:lang w:val="vi-VN"/>
-        </w:rPr>
-        <w:fldChar w:fldCharType="end"/>
-      </w:r>
+      <w:hyperlink r:id="rId8" w:tgtFrame="_blank" w:history="1">
+        <w:r>
+          <w:rPr>
+            <w:rStyle w:val="Hyperlink"/>
+            <w:rFonts w:ascii="Times New Roman" w:eastAsia="Times New Roman" w:hAnsi="Times New Roman" w:cs="Times New Roman"/>
+            <w:sz w:val="24"/>
+            <w:szCs w:val="24"/>
+            <w:lang w:val="en-US"/>
+          </w:rPr>
+          <w:t>XPath</w:t>
+        </w:r>
+      </w:hyperlink>
       <w:r>
         <w:rPr>
           <w:rFonts w:ascii="Times New Roman" w:eastAsia="Times New Roman" w:hAnsi="Times New Roman" w:cs="Times New Roman"/>
@@ -2972,112 +2578,24 @@
     <w:p>
       <w:pPr>
         <w:spacing w:line="360" w:lineRule="auto"/>
-        <w:ind w:hanging="450"/>
-        <w:jc w:val="center"/>
         <w:rPr>
           <w:rFonts w:ascii="Times New Roman" w:eastAsia="Times New Roman" w:hAnsi="Times New Roman" w:cs="Times New Roman"/>
           <w:color w:val="212529"/>
           <w:sz w:val="24"/>
           <w:szCs w:val="24"/>
-          <w:lang w:val="vi-VN"/>
+          <w:lang w:val="en-US"/>
         </w:rPr>
       </w:pPr>
     </w:p>
     <w:p>
       <w:pPr>
         <w:spacing w:line="360" w:lineRule="auto"/>
-        <w:ind w:hanging="450"/>
-        <w:jc w:val="center"/>
         <w:rPr>
           <w:rFonts w:ascii="Times New Roman" w:eastAsia="Times New Roman" w:hAnsi="Times New Roman" w:cs="Times New Roman"/>
           <w:color w:val="212529"/>
           <w:sz w:val="24"/>
           <w:szCs w:val="24"/>
-          <w:lang w:val="vi-VN"/>
-        </w:rPr>
-      </w:pPr>
-    </w:p>
-    <w:p>
-      <w:pPr>
-        <w:spacing w:line="360" w:lineRule="auto"/>
-        <w:ind w:hanging="450"/>
-        <w:jc w:val="center"/>
-        <w:rPr>
-          <w:rFonts w:ascii="Times New Roman" w:eastAsia="Times New Roman" w:hAnsi="Times New Roman" w:cs="Times New Roman"/>
-          <w:color w:val="212529"/>
-          <w:sz w:val="24"/>
-          <w:szCs w:val="24"/>
-          <w:lang w:val="vi-VN"/>
-        </w:rPr>
-      </w:pPr>
-    </w:p>
-    <w:p>
-      <w:pPr>
-        <w:spacing w:line="360" w:lineRule="auto"/>
-        <w:ind w:hanging="450"/>
-        <w:jc w:val="center"/>
-        <w:rPr>
-          <w:rFonts w:ascii="Times New Roman" w:eastAsia="Times New Roman" w:hAnsi="Times New Roman" w:cs="Times New Roman"/>
-          <w:color w:val="212529"/>
-          <w:sz w:val="24"/>
-          <w:szCs w:val="24"/>
-          <w:lang w:val="vi-VN"/>
-        </w:rPr>
-      </w:pPr>
-    </w:p>
-    <w:p>
-      <w:pPr>
-        <w:spacing w:line="360" w:lineRule="auto"/>
-        <w:ind w:hanging="450"/>
-        <w:jc w:val="center"/>
-        <w:rPr>
-          <w:rFonts w:ascii="Times New Roman" w:eastAsia="Times New Roman" w:hAnsi="Times New Roman" w:cs="Times New Roman"/>
-          <w:color w:val="212529"/>
-          <w:sz w:val="24"/>
-          <w:szCs w:val="24"/>
-          <w:lang w:val="vi-VN"/>
-        </w:rPr>
-      </w:pPr>
-    </w:p>
-    <w:p>
-      <w:pPr>
-        <w:spacing w:line="360" w:lineRule="auto"/>
-        <w:ind w:hanging="450"/>
-        <w:jc w:val="center"/>
-        <w:rPr>
-          <w:rFonts w:ascii="Times New Roman" w:eastAsia="Times New Roman" w:hAnsi="Times New Roman" w:cs="Times New Roman"/>
-          <w:color w:val="212529"/>
-          <w:sz w:val="24"/>
-          <w:szCs w:val="24"/>
-          <w:lang w:val="vi-VN"/>
-        </w:rPr>
-      </w:pPr>
-    </w:p>
-    <w:p>
-      <w:pPr>
-        <w:spacing w:line="360" w:lineRule="auto"/>
-        <w:ind w:hanging="450"/>
-        <w:jc w:val="center"/>
-        <w:rPr>
-          <w:rFonts w:ascii="Times New Roman" w:eastAsia="Times New Roman" w:hAnsi="Times New Roman" w:cs="Times New Roman"/>
-          <w:color w:val="212529"/>
-          <w:sz w:val="24"/>
-          <w:szCs w:val="24"/>
-          <w:lang w:val="vi-VN"/>
-        </w:rPr>
-      </w:pPr>
-    </w:p>
-    <w:p>
-      <w:pPr>
-        <w:spacing w:line="360" w:lineRule="auto"/>
-        <w:ind w:hanging="450"/>
-        <w:jc w:val="center"/>
-        <w:rPr>
-          <w:rFonts w:ascii="Times New Roman" w:eastAsia="Times New Roman" w:hAnsi="Times New Roman" w:cs="Times New Roman"/>
-          <w:color w:val="212529"/>
-          <w:sz w:val="24"/>
-          <w:szCs w:val="24"/>
-          <w:lang w:val="vi-VN"/>
+          <w:lang w:val="en-US"/>
         </w:rPr>
       </w:pPr>
     </w:p>
@@ -3099,6 +2617,7 @@
           <w:sz w:val="24"/>
           <w:lang w:val="en-US"/>
         </w:rPr>
+        <w:lastRenderedPageBreak/>
         <w:t xml:space="preserve">2. </w:t>
       </w:r>
       <w:r>
@@ -3162,10 +2681,10 @@
           <w:lang w:val="vi-VN"/>
         </w:rPr>
         <w:drawing>
-          <wp:inline distT="0" distB="0" distL="0" distR="0" wp14:anchorId="3CEABF74" wp14:editId="0FEECB91">
-            <wp:extent cx="3428365" cy="3428365"/>
-            <wp:effectExtent l="0" t="0" r="635" b="635"/>
-            <wp:docPr id="557736174" name="Picture 1"/>
+          <wp:inline distT="0" distB="0" distL="0" distR="0" wp14:anchorId="3347D99D" wp14:editId="1358B79A">
+            <wp:extent cx="3666490" cy="3666490"/>
+            <wp:effectExtent l="0" t="0" r="0" b="0"/>
+            <wp:docPr id="564438790" name="Picture 1"/>
             <wp:cNvGraphicFramePr>
               <a:graphicFrameLocks xmlns:a="http://schemas.openxmlformats.org/drawingml/2006/main" noChangeAspect="1"/>
             </wp:cNvGraphicFramePr>
@@ -3173,11 +2692,11 @@
               <a:graphicData uri="http://schemas.openxmlformats.org/drawingml/2006/picture">
                 <pic:pic xmlns:pic="http://schemas.openxmlformats.org/drawingml/2006/picture">
                   <pic:nvPicPr>
-                    <pic:cNvPr id="557736174" name="Picture 557736174"/>
+                    <pic:cNvPr id="564438790" name="Picture 564438790"/>
                     <pic:cNvPicPr/>
                   </pic:nvPicPr>
                   <pic:blipFill>
-                    <a:blip r:embed="rId7" cstate="print">
+                    <a:blip r:embed="rId9" cstate="print">
                       <a:extLst>
                         <a:ext uri="{28A0092B-C50C-407E-A947-70E740481C1C}">
                           <a14:useLocalDpi xmlns:a14="http://schemas.microsoft.com/office/drawing/2010/main" val="0"/>
@@ -3191,7 +2710,7 @@
                   <pic:spPr>
                     <a:xfrm>
                       <a:off x="0" y="0"/>
-                      <a:ext cx="3428365" cy="3428365"/>
+                      <a:ext cx="3670337" cy="3670337"/>
                     </a:xfrm>
                     <a:prstGeom prst="rect">
                       <a:avLst/>
@@ -3219,25 +2738,48 @@
         <w:spacing w:line="360" w:lineRule="auto"/>
         <w:rPr>
           <w:rFonts w:ascii="Times New Roman" w:hAnsi="Times New Roman" w:cs="Times New Roman"/>
-          <w:b/>
+          <w:bCs/>
           <w:sz w:val="24"/>
           <w:szCs w:val="40"/>
           <w:lang w:val="vi-VN"/>
         </w:rPr>
       </w:pPr>
-      <w:hyperlink r:id="rId8" w:history="1">
+      <w:hyperlink r:id="rId10" w:history="1">
         <w:r>
           <w:rPr>
             <w:rStyle w:val="Hyperlink"/>
-            <w:lang w:val="vi-VN"/>
-          </w:rPr>
-          <w:t>https://github.com/PNT131ITMO/6.Testing/tree/main/Lab2</w:t>
+            <w:rFonts w:ascii="Times New Roman" w:hAnsi="Times New Roman" w:cs="Times New Roman"/>
+            <w:bCs/>
+            <w:sz w:val="24"/>
+            <w:lang w:val="en-US"/>
+          </w:rPr>
+          <w:t>6.Testing/Lab3 at main · PNT1</w:t>
+        </w:r>
+        <w:r>
+          <w:rPr>
+            <w:rStyle w:val="Hyperlink"/>
+            <w:rFonts w:ascii="Times New Roman" w:hAnsi="Times New Roman" w:cs="Times New Roman"/>
+            <w:bCs/>
+            <w:sz w:val="24"/>
+            <w:lang w:val="en-US"/>
+          </w:rPr>
+          <w:t>3</w:t>
+        </w:r>
+        <w:r>
+          <w:rPr>
+            <w:rStyle w:val="Hyperlink"/>
+            <w:rFonts w:ascii="Times New Roman" w:hAnsi="Times New Roman" w:cs="Times New Roman"/>
+            <w:bCs/>
+            <w:sz w:val="24"/>
+            <w:lang w:val="en-US"/>
+          </w:rPr>
+          <w:t>1ITMO/6.Testing</w:t>
         </w:r>
       </w:hyperlink>
       <w:r>
         <w:rPr>
           <w:rFonts w:ascii="Times New Roman" w:hAnsi="Times New Roman" w:cs="Times New Roman"/>
-          <w:b/>
+          <w:bCs/>
           <w:sz w:val="24"/>
           <w:lang w:val="vi-VN"/>
         </w:rPr>
@@ -3261,7 +2803,6 @@
           <w:lang w:val="vi-VN"/>
         </w:rPr>
       </w:pPr>
-      <w:bookmarkStart w:id="2" w:name="_Toc224262803"/>
       <w:r>
         <w:rPr>
           <w:rFonts w:ascii="Times New Roman" w:hAnsi="Times New Roman" w:cs="Times New Roman"/>
@@ -3271,9 +2812,8 @@
           <w:lang w:val="vi-VN"/>
         </w:rPr>
         <w:lastRenderedPageBreak/>
-        <w:t>UML</w:t>
-      </w:r>
-      <w:bookmarkEnd w:id="2"/>
+        <w:t>UseCase-диаграмму с прецедентами использования тестируемого сайта.</w:t>
+      </w:r>
     </w:p>
     <w:p>
       <w:pPr>
@@ -3287,57 +2827,6 @@
           <w:lang w:val="vi-VN"/>
         </w:rPr>
       </w:pPr>
-      <w:r>
-        <w:rPr>
-          <w:rFonts w:ascii="Times New Roman" w:hAnsi="Times New Roman" w:cs="Times New Roman"/>
-          <w:b/>
-          <w:noProof/>
-          <w:sz w:val="24"/>
-          <w:szCs w:val="32"/>
-          <w:lang w:val="vi-VN"/>
-        </w:rPr>
-        <w:drawing>
-          <wp:inline distT="0" distB="0" distL="0" distR="0" wp14:anchorId="28C88D55" wp14:editId="4B46AF52">
-            <wp:extent cx="5924750" cy="3971925"/>
-            <wp:effectExtent l="0" t="0" r="0" b="0"/>
-            <wp:docPr id="94909297" name="Picture 2"/>
-            <wp:cNvGraphicFramePr>
-              <a:graphicFrameLocks xmlns:a="http://schemas.openxmlformats.org/drawingml/2006/main" noChangeAspect="1"/>
-            </wp:cNvGraphicFramePr>
-            <a:graphic xmlns:a="http://schemas.openxmlformats.org/drawingml/2006/main">
-              <a:graphicData uri="http://schemas.openxmlformats.org/drawingml/2006/picture">
-                <pic:pic xmlns:pic="http://schemas.openxmlformats.org/drawingml/2006/picture">
-                  <pic:nvPicPr>
-                    <pic:cNvPr id="94909297" name="Picture 94909297"/>
-                    <pic:cNvPicPr/>
-                  </pic:nvPicPr>
-                  <pic:blipFill>
-                    <a:blip r:embed="rId9">
-                      <a:extLst>
-                        <a:ext uri="{28A0092B-C50C-407E-A947-70E740481C1C}">
-                          <a14:useLocalDpi xmlns:a14="http://schemas.microsoft.com/office/drawing/2010/main" val="0"/>
-                        </a:ext>
-                      </a:extLst>
-                    </a:blip>
-                    <a:stretch>
-                      <a:fillRect/>
-                    </a:stretch>
-                  </pic:blipFill>
-                  <pic:spPr>
-                    <a:xfrm>
-                      <a:off x="0" y="0"/>
-                      <a:ext cx="5928217" cy="3974249"/>
-                    </a:xfrm>
-                    <a:prstGeom prst="rect">
-                      <a:avLst/>
-                    </a:prstGeom>
-                  </pic:spPr>
-                </pic:pic>
-              </a:graphicData>
-            </a:graphic>
-          </wp:inline>
-        </w:drawing>
-      </w:r>
     </w:p>
     <w:p>
       <w:pPr>
@@ -3369,7 +2858,7 @@
           <w:lang w:val="vi-VN"/>
         </w:rPr>
       </w:pPr>
-      <w:bookmarkStart w:id="3" w:name="_Toc224262804"/>
+      <w:bookmarkStart w:id="2" w:name="_Toc224262804"/>
       <w:r>
         <w:rPr>
           <w:rFonts w:ascii="Times New Roman" w:hAnsi="Times New Roman" w:cs="Times New Roman"/>
@@ -3380,7 +2869,7 @@
         </w:rPr>
         <w:t>Описание тестового покрытия с обоснованием его выбора</w:t>
       </w:r>
-      <w:bookmarkEnd w:id="3"/>
+      <w:bookmarkEnd w:id="2"/>
     </w:p>
     <w:p>
       <w:pPr>
@@ -3841,7 +3330,6 @@
           <w:szCs w:val="24"/>
           <w:lang w:val="en-US"/>
         </w:rPr>
-        <w:lastRenderedPageBreak/>
         <w:t>Периодичность</w:t>
       </w:r>
       <w:proofErr w:type="spellEnd"/>
@@ -4774,6 +4262,7 @@
           <w:szCs w:val="24"/>
           <w:lang w:val="en-US"/>
         </w:rPr>
+        <w:lastRenderedPageBreak/>
         <w:t>cos</w:t>
       </w:r>
       <w:r>
@@ -5903,7 +5392,6 @@
           <w:szCs w:val="24"/>
           <w:lang w:val="en-US"/>
         </w:rPr>
-        <w:lastRenderedPageBreak/>
         <w:t>Особая</w:t>
       </w:r>
       <w:proofErr w:type="spellEnd"/>
@@ -6620,6 +6108,7 @@
           <w:szCs w:val="24"/>
           <w:lang w:val="en-US"/>
         </w:rPr>
+        <w:lastRenderedPageBreak/>
         <w:t>вычисления</w:t>
       </w:r>
       <w:proofErr w:type="spellEnd"/>
@@ -7811,7 +7300,6 @@
           <w:sz w:val="24"/>
           <w:szCs w:val="24"/>
         </w:rPr>
-        <w:lastRenderedPageBreak/>
         <w:t xml:space="preserve">далее по одному модулю заменяется на “реальную” реализацию (например, </w:t>
       </w:r>
       <w:r>
@@ -8496,6 +7984,7 @@
           <w:sz w:val="24"/>
           <w:szCs w:val="24"/>
         </w:rPr>
+        <w:lastRenderedPageBreak/>
         <w:t xml:space="preserve">для базовых функций </w:t>
       </w:r>
       <w:r>
@@ -9072,7 +8561,6 @@
           <w:sz w:val="24"/>
           <w:szCs w:val="24"/>
         </w:rPr>
-        <w:lastRenderedPageBreak/>
         <w:t>Тестовое покрытие</w:t>
       </w:r>
     </w:p>
@@ -9128,6 +8616,7 @@
         <w:rPr>
           <w:noProof/>
         </w:rPr>
+        <w:lastRenderedPageBreak/>
         <w:drawing>
           <wp:inline distT="0" distB="0" distL="0" distR="0" wp14:anchorId="665EB5BF" wp14:editId="29FBFC5B">
             <wp:extent cx="5229225" cy="3737312"/>
@@ -9144,7 +8633,7 @@
                     <pic:cNvPicPr/>
                   </pic:nvPicPr>
                   <pic:blipFill>
-                    <a:blip r:embed="rId10"/>
+                    <a:blip r:embed="rId11"/>
                     <a:stretch>
                       <a:fillRect/>
                     </a:stretch>
@@ -9224,7 +8713,7 @@
                     <pic:cNvPicPr/>
                   </pic:nvPicPr>
                   <pic:blipFill>
-                    <a:blip r:embed="rId11"/>
+                    <a:blip r:embed="rId12"/>
                     <a:stretch>
                       <a:fillRect/>
                     </a:stretch>
@@ -9421,10 +8910,9 @@
           <w:szCs w:val="32"/>
           <w:lang w:val="vi-VN"/>
         </w:rPr>
-        <w:lastRenderedPageBreak/>
         <w:tab/>
       </w:r>
-      <w:bookmarkStart w:id="4" w:name="_Toc224262805"/>
+      <w:bookmarkStart w:id="3" w:name="_Toc224262805"/>
       <w:r>
         <w:rPr>
           <w:rFonts w:ascii="Times New Roman" w:hAnsi="Times New Roman" w:cs="Times New Roman"/>
@@ -9434,7 +8922,7 @@
         </w:rPr>
         <w:t>5.Графики</w:t>
       </w:r>
-      <w:bookmarkEnd w:id="4"/>
+      <w:bookmarkEnd w:id="3"/>
     </w:p>
     <w:p>
       <w:pPr>
@@ -9472,6 +8960,7 @@
           <w:szCs w:val="32"/>
           <w:lang w:val="vi-VN"/>
         </w:rPr>
+        <w:lastRenderedPageBreak/>
         <w:t xml:space="preserve">   </w:t>
       </w:r>
       <w:r>
@@ -9499,7 +8988,7 @@
                     <pic:cNvPicPr/>
                   </pic:nvPicPr>
                   <pic:blipFill>
-                    <a:blip r:embed="rId12" cstate="print">
+                    <a:blip r:embed="rId13" cstate="print">
                       <a:extLst>
                         <a:ext uri="{28A0092B-C50C-407E-A947-70E740481C1C}">
                           <a14:useLocalDpi xmlns:a14="http://schemas.microsoft.com/office/drawing/2010/main" val="0"/>
@@ -9550,7 +9039,7 @@
                     <pic:cNvPicPr/>
                   </pic:nvPicPr>
                   <pic:blipFill>
-                    <a:blip r:embed="rId13" cstate="print">
+                    <a:blip r:embed="rId14" cstate="print">
                       <a:extLst>
                         <a:ext uri="{28A0092B-C50C-407E-A947-70E740481C1C}">
                           <a14:useLocalDpi xmlns:a14="http://schemas.microsoft.com/office/drawing/2010/main" val="0"/>
@@ -9601,7 +9090,7 @@
                     <pic:cNvPicPr/>
                   </pic:nvPicPr>
                   <pic:blipFill>
-                    <a:blip r:embed="rId14" cstate="print">
+                    <a:blip r:embed="rId15" cstate="print">
                       <a:extLst>
                         <a:ext uri="{28A0092B-C50C-407E-A947-70E740481C1C}">
                           <a14:useLocalDpi xmlns:a14="http://schemas.microsoft.com/office/drawing/2010/main" val="0"/>
@@ -9663,7 +9152,7 @@
                     <pic:cNvPicPr/>
                   </pic:nvPicPr>
                   <pic:blipFill>
-                    <a:blip r:embed="rId15" cstate="print">
+                    <a:blip r:embed="rId16" cstate="print">
                       <a:extLst>
                         <a:ext uri="{28A0092B-C50C-407E-A947-70E740481C1C}">
                           <a14:useLocalDpi xmlns:a14="http://schemas.microsoft.com/office/drawing/2010/main" val="0"/>
@@ -9714,7 +9203,7 @@
                     <pic:cNvPicPr/>
                   </pic:nvPicPr>
                   <pic:blipFill>
-                    <a:blip r:embed="rId16" cstate="print">
+                    <a:blip r:embed="rId17" cstate="print">
                       <a:extLst>
                         <a:ext uri="{28A0092B-C50C-407E-A947-70E740481C1C}">
                           <a14:useLocalDpi xmlns:a14="http://schemas.microsoft.com/office/drawing/2010/main" val="0"/>
@@ -9765,7 +9254,7 @@
                     <pic:cNvPicPr/>
                   </pic:nvPicPr>
                   <pic:blipFill>
-                    <a:blip r:embed="rId17" cstate="print">
+                    <a:blip r:embed="rId18" cstate="print">
                       <a:extLst>
                         <a:ext uri="{28A0092B-C50C-407E-A947-70E740481C1C}">
                           <a14:useLocalDpi xmlns:a14="http://schemas.microsoft.com/office/drawing/2010/main" val="0"/>
@@ -9816,7 +9305,7 @@
                     <pic:cNvPicPr/>
                   </pic:nvPicPr>
                   <pic:blipFill>
-                    <a:blip r:embed="rId18" cstate="print">
+                    <a:blip r:embed="rId19" cstate="print">
                       <a:extLst>
                         <a:ext uri="{28A0092B-C50C-407E-A947-70E740481C1C}">
                           <a14:useLocalDpi xmlns:a14="http://schemas.microsoft.com/office/drawing/2010/main" val="0"/>
@@ -9878,7 +9367,7 @@
                     <pic:cNvPicPr/>
                   </pic:nvPicPr>
                   <pic:blipFill>
-                    <a:blip r:embed="rId19" cstate="print">
+                    <a:blip r:embed="rId20" cstate="print">
                       <a:extLst>
                         <a:ext uri="{28A0092B-C50C-407E-A947-70E740481C1C}">
                           <a14:useLocalDpi xmlns:a14="http://schemas.microsoft.com/office/drawing/2010/main" val="0"/>
@@ -9930,7 +9419,7 @@
                     <pic:cNvPicPr/>
                   </pic:nvPicPr>
                   <pic:blipFill>
-                    <a:blip r:embed="rId20" cstate="print">
+                    <a:blip r:embed="rId21" cstate="print">
                       <a:extLst>
                         <a:ext uri="{28A0092B-C50C-407E-A947-70E740481C1C}">
                           <a14:useLocalDpi xmlns:a14="http://schemas.microsoft.com/office/drawing/2010/main" val="0"/>
@@ -9992,7 +9481,7 @@
                     <pic:cNvPicPr/>
                   </pic:nvPicPr>
                   <pic:blipFill>
-                    <a:blip r:embed="rId21" cstate="print">
+                    <a:blip r:embed="rId22" cstate="print">
                       <a:extLst>
                         <a:ext uri="{28A0092B-C50C-407E-A947-70E740481C1C}">
                           <a14:useLocalDpi xmlns:a14="http://schemas.microsoft.com/office/drawing/2010/main" val="0"/>
@@ -10043,7 +9532,7 @@
                     <pic:cNvPicPr/>
                   </pic:nvPicPr>
                   <pic:blipFill>
-                    <a:blip r:embed="rId22" cstate="print">
+                    <a:blip r:embed="rId23" cstate="print">
                       <a:extLst>
                         <a:ext uri="{28A0092B-C50C-407E-A947-70E740481C1C}">
                           <a14:useLocalDpi xmlns:a14="http://schemas.microsoft.com/office/drawing/2010/main" val="0"/>
@@ -10100,7 +9589,7 @@
           <w:lang w:val="vi-VN"/>
         </w:rPr>
       </w:pPr>
-      <w:bookmarkStart w:id="5" w:name="_Toc224262806"/>
+      <w:bookmarkStart w:id="4" w:name="_Toc224262806"/>
       <w:r>
         <w:rPr>
           <w:rFonts w:ascii="Times New Roman" w:hAnsi="Times New Roman" w:cs="Times New Roman"/>
@@ -10131,7 +9620,7 @@
         </w:rPr>
         <w:t>Вывод:</w:t>
       </w:r>
-      <w:bookmarkEnd w:id="5"/>
+      <w:bookmarkEnd w:id="4"/>
       <w:r>
         <w:rPr>
           <w:rFonts w:ascii="Times New Roman" w:hAnsi="Times New Roman" w:cs="Times New Roman"/>

</xml_diff>